<commit_message>
1.3.0 (B1–B3): thành viên Hội đồng, Ban cưỡng chế lưu theo dự án, T27/T28 tự điền từ Ban (T16); T30 trường thành viên riêng; T31 lấy căn nhà ở, giá, căn cứ từ quỹ TĐC; báo cáo phân cấp so sánh kỳ trước
Co-Authored-By: Claude Opus 5.5 <noreply@anthropic.com>
Claude-Session: https://claude.ai/code/session_01BZcswa4gE3voAhFCMjfJc5
</commit_message>
<xml_diff>
--- a/apps/desktop/public/mau-van-ban/bao-cao-phan-cap.docx
+++ b/apps/desktop/public/mau-van-ban/bao-cao-phan-cap.docx
@@ -334,6 +334,21 @@
         <w:t xml:space="preserve">{tong_quat}</w:t>
       </w:r>
     </w:p>
+    <w:p>
+      <w:pPr>
+        <w:spacing w:after="120" w:before="0" w:line="288" w:lineRule="auto"/>
+        <w:ind w:left="0" w:firstLine="567"/>
+        <w:jc w:val="both"/>
+      </w:pPr>
+      <w:r>
+        <w:rPr>
+          <w:rFonts w:ascii="Times New Roman" w:cs="Times New Roman" w:eastAsia="Times New Roman" w:hAnsi="Times New Roman"/>
+          <w:sz w:val="28"/>
+          <w:szCs w:val="28"/>
+        </w:rPr>
+        <w:t xml:space="preserve">{cau_ky_truoc}</w:t>
+      </w:r>
+    </w:p>
     <w:tbl>
       <w:tblPr>
         <w:tblW w:type="dxa" w:w="9355"/>
@@ -350,8 +365,9 @@
         <w:gridCol w:w="561"/>
         <w:gridCol w:w="3181"/>
         <w:gridCol w:w="1684"/>
-        <w:gridCol w:w="842"/>
-        <w:gridCol w:w="3087"/>
+        <w:gridCol w:w="748"/>
+        <w:gridCol w:w="748"/>
+        <w:gridCol w:w="2432"/>
       </w:tblGrid>
       <w:tr>
         <w:trPr>
@@ -437,7 +453,7 @@
         </w:tc>
         <w:tc>
           <w:tcPr>
-            <w:tcW w:type="dxa" w:w="842"/>
+            <w:tcW w:type="dxa" w:w="748"/>
             <w:tcBorders>
               <w:top w:val="single" w:color="000000" w:sz="4"/>
               <w:left w:val="single" w:color="000000" w:sz="4"/>
@@ -463,7 +479,7 @@
         </w:tc>
         <w:tc>
           <w:tcPr>
-            <w:tcW w:type="dxa" w:w="3087"/>
+            <w:tcW w:type="dxa" w:w="748"/>
             <w:tcBorders>
               <w:top w:val="single" w:color="000000" w:sz="4"/>
               <w:left w:val="single" w:color="000000" w:sz="4"/>
@@ -483,15 +499,13 @@
                 <w:sz w:val="24"/>
                 <w:szCs w:val="24"/>
               </w:rPr>
-              <w:t xml:space="preserve">Văn bản đã ban hành (số, ngày; dự án)</w:t>
-            </w:r>
-          </w:p>
-        </w:tc>
-      </w:tr>
-      <w:tr>
-        <w:tc>
-          <w:tcPr>
-            <w:tcW w:type="dxa" w:w="561"/>
+              <w:t xml:space="preserve">Kỳ trước</w:t>
+            </w:r>
+          </w:p>
+        </w:tc>
+        <w:tc>
+          <w:tcPr>
+            <w:tcW w:type="dxa" w:w="2432"/>
             <w:tcBorders>
               <w:top w:val="single" w:color="000000" w:sz="4"/>
               <w:left w:val="single" w:color="000000" w:sz="4"/>
@@ -506,6 +520,34 @@
             <w:r>
               <w:rPr>
                 <w:rFonts w:ascii="Times New Roman" w:cs="Times New Roman" w:eastAsia="Times New Roman" w:hAnsi="Times New Roman"/>
+                <w:b/>
+                <w:bCs/>
+                <w:sz w:val="24"/>
+                <w:szCs w:val="24"/>
+              </w:rPr>
+              <w:t xml:space="preserve">Văn bản đã ban hành (số, ngày; dự án)</w:t>
+            </w:r>
+          </w:p>
+        </w:tc>
+      </w:tr>
+      <w:tr>
+        <w:tc>
+          <w:tcPr>
+            <w:tcW w:type="dxa" w:w="561"/>
+            <w:tcBorders>
+              <w:top w:val="single" w:color="000000" w:sz="4"/>
+              <w:left w:val="single" w:color="000000" w:sz="4"/>
+              <w:bottom w:val="single" w:color="000000" w:sz="4"/>
+              <w:right w:val="single" w:color="000000" w:sz="4"/>
+            </w:tcBorders>
+          </w:tcPr>
+          <w:p>
+            <w:pPr>
+              <w:jc w:val="center"/>
+            </w:pPr>
+            <w:r>
+              <w:rPr>
+                <w:rFonts w:ascii="Times New Roman" w:cs="Times New Roman" w:eastAsia="Times New Roman" w:hAnsi="Times New Roman"/>
                 <w:b w:val="false"/>
                 <w:bCs w:val="false"/>
                 <w:sz w:val="24"/>
@@ -569,7 +611,7 @@
         </w:tc>
         <w:tc>
           <w:tcPr>
-            <w:tcW w:type="dxa" w:w="842"/>
+            <w:tcW w:type="dxa" w:w="748"/>
             <w:tcBorders>
               <w:top w:val="single" w:color="000000" w:sz="4"/>
               <w:left w:val="single" w:color="000000" w:sz="4"/>
@@ -595,7 +637,33 @@
         </w:tc>
         <w:tc>
           <w:tcPr>
-            <w:tcW w:type="dxa" w:w="3087"/>
+            <w:tcW w:type="dxa" w:w="748"/>
+            <w:tcBorders>
+              <w:top w:val="single" w:color="000000" w:sz="4"/>
+              <w:left w:val="single" w:color="000000" w:sz="4"/>
+              <w:bottom w:val="single" w:color="000000" w:sz="4"/>
+              <w:right w:val="single" w:color="000000" w:sz="4"/>
+            </w:tcBorders>
+          </w:tcPr>
+          <w:p>
+            <w:pPr>
+              <w:jc w:val="center"/>
+            </w:pPr>
+            <w:r>
+              <w:rPr>
+                <w:rFonts w:ascii="Times New Roman" w:cs="Times New Roman" w:eastAsia="Times New Roman" w:hAnsi="Times New Roman"/>
+                <w:b w:val="false"/>
+                <w:bCs w:val="false"/>
+                <w:sz w:val="24"/>
+                <w:szCs w:val="24"/>
+              </w:rPr>
+              <w:t xml:space="preserve">{so_truoc}</w:t>
+            </w:r>
+          </w:p>
+        </w:tc>
+        <w:tc>
+          <w:tcPr>
+            <w:tcW w:type="dxa" w:w="2432"/>
             <w:tcBorders>
               <w:top w:val="single" w:color="000000" w:sz="4"/>
               <w:left w:val="single" w:color="000000" w:sz="4"/>

</xml_diff>